<commit_message>
Teach AI concepts before exam practice and redesign lesson visuals
</commit_message>
<xml_diff>
--- a/0478 P1/Artificial Intelligence/Artificial_Intelligence_Answer_Key.docx
+++ b/0478 P1/Artificial Intelligence/Artificial_Intelligence_Answer_Key.docx
@@ -64,7 +64,7 @@
           <w:sz w:val="21"/>
           <w:szCs w:val="21"/>
         </w:rPr>
-        <w:t xml:space="preserve">Exam-led revision: 21 Paper 1 papers and their published Cambridge mark schemes (2023–2025); 29 AI parts audited. Practice questions are adapted/paraphrased from the cited papers; official mark allocations retained. Model answers and teaching commentary are our own.</w:t>
+        <w:t xml:space="preserve">Teacher research: 21 Paper 1 papers and their published Cambridge mark schemes (2023–2025); 29 AI parts audited. Practice questions are adapted/paraphrased from the cited papers; official mark allocations retained. Model answers and teaching commentary are our own.</w:t>
       </w:r>
     </w:p>
     <w:p>
@@ -77,7 +77,7 @@
           <w:sz w:val="21"/>
           <w:szCs w:val="21"/>
         </w:rPr>
-        <w:t xml:space="preserve">60-minute core route: 6 min recall (Task 1 selected parts); 8 min AI/Task 2; 12 min components (Task 3 selected parts); 14 min diagnosis/Task 4; 16 min ML/navigation (Task 5 selected parts); 4 min exit. Use remaining questions and Task 6 for a second lesson or homework with feedback.</w:t>
+        <w:t xml:space="preserve">Concept-first route: 5 min recall (Task 1 selected parts); 5 min automation vs AI; 12 min expert-system examples and process; 12 min machine-learning examples and mechanism; 8 min classification and explanation checks; 15 min selected exam practice; 3 min exit. Teach slides 1–17 before exam framing begins on slide 18. Use the full practice bank in a second period or homework with feedback.</w:t>
       </w:r>
     </w:p>
     <w:p>
@@ -10930,6 +10930,61 @@
     <w:p>
       <w:pPr>
         <w:keepNext/>
+        <w:spacing w:before="200" w:after="100"/>
+      </w:pPr>
+      <w:r>
+        <w:rPr>
+          <w:b/>
+          <w:bCs/>
+          <w:color w:val="494985"/>
+          <w:sz w:val="24"/>
+          <w:szCs w:val="24"/>
+        </w:rPr>
+        <w:t xml:space="preserve">Concept checks before exam practice</w:t>
+      </w:r>
+    </w:p>
+    <w:p>
+      <w:pPr>
+        <w:spacing w:after="120" w:before="0"/>
+      </w:pPr>
+      <w:r>
+        <w:rPr>
+          <w:color w:val="202124"/>
+          <w:sz w:val="21"/>
+          <w:szCs w:val="21"/>
+        </w:rPr>
+        <w:t xml:space="preserve">Automation comparison / classification: a stored wash cycle or fixed signal timing does not by itself establish AI. A system learning seasonal patterns from past weather data is machine learning. The behaviour and method matter more than the pictured hardware.</w:t>
+      </w:r>
+    </w:p>
+    <w:p>
+      <w:pPr>
+        <w:spacing w:after="120" w:before="0"/>
+      </w:pPr>
+      <w:r>
+        <w:rPr>
+          <w:color w:val="202124"/>
+          <w:sz w:val="21"/>
+          <w:szCs w:val="21"/>
+        </w:rPr>
+        <w:t xml:space="preserve">Expert-system explanation: knowledge base stores expert facts; rule base stores IF–THEN rules; inference engine applies rules to facts and reaches a decision. Fixed expert knowledge can work without learning; a system can combine expert rules with ML.</w:t>
+      </w:r>
+    </w:p>
+    <w:p>
+      <w:pPr>
+        <w:spacing w:after="120" w:before="0"/>
+      </w:pPr>
+      <w:r>
+        <w:rPr>
+          <w:color w:val="202124"/>
+          <w:sz w:val="21"/>
+          <w:szCs w:val="21"/>
+        </w:rPr>
+        <w:t xml:space="preserve">Recycling transfer: collect varied labelled images, learn classification patterns, test on held-out images and use appropriate feedback to update processes or data. Credit a relevant explanation of changed later classification. These are original checks, with suggested answers rather than official marks.</w:t>
+      </w:r>
+    </w:p>
+    <w:p>
+      <w:pPr>
+        <w:keepNext/>
         <w:pageBreakBefore/>
         <w:pBdr>
           <w:left w:val="single" w:color="FFD84D" w:sz="24" w:space="6"/>
@@ -10958,7 +11013,7 @@
           <w:sz w:val="21"/>
           <w:szCs w:val="21"/>
         </w:rPr>
-        <w:t xml:space="preserve">Exam-led revision: 21 Paper 1 papers and their published Cambridge mark schemes (2023–2025); 29 AI parts audited. Practice questions are adapted/paraphrased from the cited papers; official mark allocations retained. Model answers and teaching commentary are our own.</w:t>
+        <w:t xml:space="preserve">Teacher research: 21 Paper 1 papers and their published Cambridge mark schemes (2023–2025); 29 AI parts audited. Practice questions are adapted/paraphrased from the cited papers; official mark allocations retained. Model answers and teaching commentary are our own.</w:t>
       </w:r>
     </w:p>
     <w:p>
@@ -10971,218 +11026,824 @@
           <w:sz w:val="21"/>
           <w:szCs w:val="21"/>
         </w:rPr>
-        <w:t xml:space="preserve">Photographs illustrate representative hardware and settings. No claim is made that a pictured product implements the hypothetical exam capability. Images resized/recompressed only; no subject alterations.</w:t>
-      </w:r>
-    </w:p>
-    <w:p>
-      <w:pPr>
-        <w:keepNext/>
-        <w:spacing w:before="200" w:after="100"/>
+        <w:t xml:space="preserve">Actual photographs from Wikimedia Commons. Images resized/recompressed with aspect-preserving crops in some slide placements; no subject alterations. Photographs illustrate representative hardware and settings.</w:t>
+      </w:r>
+    </w:p>
+    <w:p>
+      <w:pPr>
+        <w:keepNext/>
+        <w:spacing w:after="20" w:before="0"/>
       </w:pPr>
       <w:r>
         <w:rPr>
           <w:b/>
           <w:bCs/>
-          <w:color w:val="494985"/>
-          <w:sz w:val="24"/>
-          <w:szCs w:val="24"/>
-        </w:rPr>
-        <w:t xml:space="preserve">factory — Mixabest — CC BY-SA 3.0</w:t>
-      </w:r>
-    </w:p>
-    <w:p>
-      <w:pPr>
-        <w:spacing w:after="120" w:before="0"/>
-      </w:pPr>
-      <w:r>
-        <w:rPr>
           <w:color w:val="202124"/>
-          <w:sz w:val="17"/>
-          <w:szCs w:val="17"/>
-        </w:rPr>
-        <w:t xml:space="preserve">https://commons.wikimedia.org/wiki/File:KUKA_Industrial_Robots_IR.jpg</w:t>
-      </w:r>
-    </w:p>
-    <w:p>
-      <w:pPr>
-        <w:spacing w:after="120" w:before="0"/>
-      </w:pPr>
-      <w:r>
-        <w:rPr>
-          <w:color w:val="202124"/>
-          <w:sz w:val="17"/>
-          <w:szCs w:val="17"/>
-        </w:rPr>
-        <w:t xml:space="preserve">https://creativecommons.org/licenses/by-sa/3.0/</w:t>
-      </w:r>
-    </w:p>
-    <w:p>
-      <w:pPr>
-        <w:keepNext/>
-        <w:spacing w:before="200" w:after="100"/>
+          <w:sz w:val="18"/>
+          <w:szCs w:val="18"/>
+        </w:rPr>
+        <w:t xml:space="preserve">FACTORY — Mixabest — CC BY-SA 3.0</w:t>
+      </w:r>
+    </w:p>
+    <w:p>
+      <w:pPr>
+        <w:spacing w:after="95"/>
+      </w:pPr>
+      <w:hyperlink w:history="1" r:id="rIdgt26i8vbr6b02f6loybw5">
+        <w:r>
+          <w:rPr>
+            <w:rStyle w:val="Hyperlink"/>
+            <w:sz w:val="16"/>
+            <w:szCs w:val="16"/>
+          </w:rPr>
+          <w:t xml:space="preserve">Photograph source</w:t>
+        </w:r>
+      </w:hyperlink>
+      <w:r>
+        <w:rPr>
+          <w:sz w:val="16"/>
+          <w:szCs w:val="16"/>
+        </w:rPr>
+        <w:t xml:space="preserve">  ·  </w:t>
+      </w:r>
+      <w:hyperlink w:history="1" r:id="rIdtmlpjfz5txxfta0tqkxmy">
+        <w:r>
+          <w:rPr>
+            <w:rStyle w:val="Hyperlink"/>
+            <w:sz w:val="16"/>
+            <w:szCs w:val="16"/>
+          </w:rPr>
+          <w:t xml:space="preserve">Licence terms</w:t>
+        </w:r>
+      </w:hyperlink>
+    </w:p>
+    <w:p>
+      <w:pPr>
+        <w:keepNext/>
+        <w:spacing w:after="20" w:before="0"/>
       </w:pPr>
       <w:r>
         <w:rPr>
           <w:b/>
           <w:bCs/>
-          <w:color w:val="494985"/>
-          <w:sz w:val="24"/>
-          <w:szCs w:val="24"/>
-        </w:rPr>
-        <w:t xml:space="preserve">vacuum — Autopilot — CC BY-SA 3.0</w:t>
-      </w:r>
-    </w:p>
-    <w:p>
-      <w:pPr>
-        <w:spacing w:after="120" w:before="0"/>
-      </w:pPr>
-      <w:r>
-        <w:rPr>
           <w:color w:val="202124"/>
-          <w:sz w:val="17"/>
-          <w:szCs w:val="17"/>
-        </w:rPr>
-        <w:t xml:space="preserve">https://commons.wikimedia.org/wiki/File:Neato_XV-11.jpg</w:t>
-      </w:r>
-    </w:p>
-    <w:p>
-      <w:pPr>
-        <w:spacing w:after="120" w:before="0"/>
-      </w:pPr>
-      <w:r>
-        <w:rPr>
-          <w:color w:val="202124"/>
-          <w:sz w:val="17"/>
-          <w:szCs w:val="17"/>
-        </w:rPr>
-        <w:t xml:space="preserve">https://creativecommons.org/licenses/by-sa/3.0/</w:t>
-      </w:r>
-    </w:p>
-    <w:p>
-      <w:pPr>
-        <w:keepNext/>
-        <w:spacing w:before="200" w:after="100"/>
+          <w:sz w:val="18"/>
+          <w:szCs w:val="18"/>
+        </w:rPr>
+        <w:t xml:space="preserve">VACUUM — Autopilot — CC BY-SA 3.0</w:t>
+      </w:r>
+    </w:p>
+    <w:p>
+      <w:pPr>
+        <w:spacing w:after="95"/>
+      </w:pPr>
+      <w:hyperlink w:history="1" r:id="rIde46a0ug1i6onffuvcrjrn">
+        <w:r>
+          <w:rPr>
+            <w:rStyle w:val="Hyperlink"/>
+            <w:sz w:val="16"/>
+            <w:szCs w:val="16"/>
+          </w:rPr>
+          <w:t xml:space="preserve">Photograph source</w:t>
+        </w:r>
+      </w:hyperlink>
+      <w:r>
+        <w:rPr>
+          <w:sz w:val="16"/>
+          <w:szCs w:val="16"/>
+        </w:rPr>
+        <w:t xml:space="preserve">  ·  </w:t>
+      </w:r>
+      <w:hyperlink w:history="1" r:id="rIdfx-xnmoccey1aa9elatwv">
+        <w:r>
+          <w:rPr>
+            <w:rStyle w:val="Hyperlink"/>
+            <w:sz w:val="16"/>
+            <w:szCs w:val="16"/>
+          </w:rPr>
+          <w:t xml:space="preserve">Licence terms</w:t>
+        </w:r>
+      </w:hyperlink>
+    </w:p>
+    <w:p>
+      <w:pPr>
+        <w:keepNext/>
+        <w:spacing w:after="20" w:before="0"/>
       </w:pPr>
       <w:r>
         <w:rPr>
           <w:b/>
           <w:bCs/>
-          <w:color w:val="494985"/>
-          <w:sz w:val="24"/>
-          <w:szCs w:val="24"/>
-        </w:rPr>
-        <w:t xml:space="preserve">speaker — NDB Photos — CC BY-SA 2.0</w:t>
-      </w:r>
-    </w:p>
-    <w:p>
-      <w:pPr>
-        <w:spacing w:after="120" w:before="0"/>
-      </w:pPr>
-      <w:r>
-        <w:rPr>
           <w:color w:val="202124"/>
-          <w:sz w:val="17"/>
-          <w:szCs w:val="17"/>
-        </w:rPr>
-        <w:t xml:space="preserve">https://commons.wikimedia.org/wiki/File:Google_Home_sitting_on_table.jpg</w:t>
-      </w:r>
-    </w:p>
-    <w:p>
-      <w:pPr>
-        <w:spacing w:after="120" w:before="0"/>
-      </w:pPr>
-      <w:r>
-        <w:rPr>
-          <w:color w:val="202124"/>
-          <w:sz w:val="17"/>
-          <w:szCs w:val="17"/>
-        </w:rPr>
-        <w:t xml:space="preserve">https://creativecommons.org/licenses/by-sa/2.0/</w:t>
-      </w:r>
-    </w:p>
-    <w:p>
-      <w:pPr>
-        <w:keepNext/>
-        <w:spacing w:before="200" w:after="100"/>
+          <w:sz w:val="18"/>
+          <w:szCs w:val="18"/>
+        </w:rPr>
+        <w:t xml:space="preserve">SPEAKER — NDB Photos — CC BY-SA 2.0</w:t>
+      </w:r>
+    </w:p>
+    <w:p>
+      <w:pPr>
+        <w:spacing w:after="95"/>
+      </w:pPr>
+      <w:hyperlink w:history="1" r:id="rIdiliedgfwr4psrqfxw-jvs">
+        <w:r>
+          <w:rPr>
+            <w:rStyle w:val="Hyperlink"/>
+            <w:sz w:val="16"/>
+            <w:szCs w:val="16"/>
+          </w:rPr>
+          <w:t xml:space="preserve">Photograph source</w:t>
+        </w:r>
+      </w:hyperlink>
+      <w:r>
+        <w:rPr>
+          <w:sz w:val="16"/>
+          <w:szCs w:val="16"/>
+        </w:rPr>
+        <w:t xml:space="preserve">  ·  </w:t>
+      </w:r>
+      <w:hyperlink w:history="1" r:id="rId94sdefb555ibhsioqhwte">
+        <w:r>
+          <w:rPr>
+            <w:rStyle w:val="Hyperlink"/>
+            <w:sz w:val="16"/>
+            <w:szCs w:val="16"/>
+          </w:rPr>
+          <w:t xml:space="preserve">Licence terms</w:t>
+        </w:r>
+      </w:hyperlink>
+    </w:p>
+    <w:p>
+      <w:pPr>
+        <w:keepNext/>
+        <w:spacing w:after="20" w:before="0"/>
       </w:pPr>
       <w:r>
         <w:rPr>
           <w:b/>
           <w:bCs/>
-          <w:color w:val="494985"/>
-          <w:sz w:val="24"/>
-          <w:szCs w:val="24"/>
-        </w:rPr>
-        <w:t xml:space="preserve">weather — NOAA / US government (photographer uncredited) — Public domain</w:t>
-      </w:r>
-    </w:p>
-    <w:p>
-      <w:pPr>
-        <w:spacing w:after="120" w:before="0"/>
-      </w:pPr>
-      <w:r>
-        <w:rPr>
           <w:color w:val="202124"/>
-          <w:sz w:val="17"/>
-          <w:szCs w:val="17"/>
-        </w:rPr>
-        <w:t xml:space="preserve">https://commons.wikimedia.org/wiki/File:NOAA_weather_station_at_Wake_Island_harbor.jpg</w:t>
-      </w:r>
-    </w:p>
-    <w:p>
-      <w:pPr>
-        <w:spacing w:after="120" w:before="0"/>
-      </w:pPr>
-      <w:r>
-        <w:rPr>
-          <w:color w:val="202124"/>
-          <w:sz w:val="17"/>
-          <w:szCs w:val="17"/>
-        </w:rPr>
-        <w:t xml:space="preserve">https://commons.wikimedia.org/wiki/Commons:Copyright_rules_by_territory/United_States#Federal_works</w:t>
-      </w:r>
-    </w:p>
-    <w:p>
-      <w:pPr>
-        <w:keepNext/>
-        <w:spacing w:before="200" w:after="100"/>
+          <w:sz w:val="18"/>
+          <w:szCs w:val="18"/>
+        </w:rPr>
+        <w:t xml:space="preserve">WEATHER — NOAA / US government (photographer uncredited) — Public domain</w:t>
+      </w:r>
+    </w:p>
+    <w:p>
+      <w:pPr>
+        <w:spacing w:after="95"/>
+      </w:pPr>
+      <w:hyperlink w:history="1" r:id="rIde7c9um2qjslumfy4xvukc">
+        <w:r>
+          <w:rPr>
+            <w:rStyle w:val="Hyperlink"/>
+            <w:sz w:val="16"/>
+            <w:szCs w:val="16"/>
+          </w:rPr>
+          <w:t xml:space="preserve">Photograph source</w:t>
+        </w:r>
+      </w:hyperlink>
+      <w:r>
+        <w:rPr>
+          <w:sz w:val="16"/>
+          <w:szCs w:val="16"/>
+        </w:rPr>
+        <w:t xml:space="preserve">  ·  </w:t>
+      </w:r>
+      <w:hyperlink w:history="1" r:id="rIdvf3vgy5t86wxaj1-0id8m">
+        <w:r>
+          <w:rPr>
+            <w:rStyle w:val="Hyperlink"/>
+            <w:sz w:val="16"/>
+            <w:szCs w:val="16"/>
+          </w:rPr>
+          <w:t xml:space="preserve">Licence terms</w:t>
+        </w:r>
+      </w:hyperlink>
+    </w:p>
+    <w:p>
+      <w:pPr>
+        <w:keepNext/>
+        <w:spacing w:after="20" w:before="0"/>
       </w:pPr>
       <w:r>
         <w:rPr>
           <w:b/>
           <w:bCs/>
-          <w:color w:val="494985"/>
-          <w:sz w:val="24"/>
-          <w:szCs w:val="24"/>
-        </w:rPr>
-        <w:t xml:space="preserve">garage — ANT Berezhnyi — CC BY 3.0</w:t>
-      </w:r>
-    </w:p>
-    <w:p>
-      <w:pPr>
-        <w:spacing w:after="120" w:before="0"/>
-      </w:pPr>
-      <w:r>
-        <w:rPr>
           <w:color w:val="202124"/>
-          <w:sz w:val="17"/>
-          <w:szCs w:val="17"/>
-        </w:rPr>
-        <w:t xml:space="preserve">https://commons.wikimedia.org/wiki/File:Chery_A1_-_service_shop_in_Ukraine_%287%29.jpg</w:t>
-      </w:r>
-    </w:p>
-    <w:p>
-      <w:pPr>
-        <w:spacing w:after="120" w:before="0"/>
-      </w:pPr>
-      <w:r>
-        <w:rPr>
+          <w:sz w:val="18"/>
+          <w:szCs w:val="18"/>
+        </w:rPr>
+        <w:t xml:space="preserve">GARAGE — ANT Berezhnyi — CC BY 3.0</w:t>
+      </w:r>
+    </w:p>
+    <w:p>
+      <w:pPr>
+        <w:spacing w:after="95"/>
+      </w:pPr>
+      <w:hyperlink w:history="1" r:id="rIdnugcbt0pnvwrqxi6adzbt">
+        <w:r>
+          <w:rPr>
+            <w:rStyle w:val="Hyperlink"/>
+            <w:sz w:val="16"/>
+            <w:szCs w:val="16"/>
+          </w:rPr>
+          <w:t xml:space="preserve">Photograph source</w:t>
+        </w:r>
+      </w:hyperlink>
+      <w:r>
+        <w:rPr>
+          <w:sz w:val="16"/>
+          <w:szCs w:val="16"/>
+        </w:rPr>
+        <w:t xml:space="preserve">  ·  </w:t>
+      </w:r>
+      <w:hyperlink w:history="1" r:id="rIdo_lyhk5isugf0vdu-omnz">
+        <w:r>
+          <w:rPr>
+            <w:rStyle w:val="Hyperlink"/>
+            <w:sz w:val="16"/>
+            <w:szCs w:val="16"/>
+          </w:rPr>
+          <w:t xml:space="preserve">Licence terms</w:t>
+        </w:r>
+      </w:hyperlink>
+    </w:p>
+    <w:p>
+      <w:pPr>
+        <w:keepNext/>
+        <w:spacing w:after="20" w:before="0"/>
+      </w:pPr>
+      <w:r>
+        <w:rPr>
+          <w:b/>
+          <w:bCs/>
           <w:color w:val="202124"/>
-          <w:sz w:val="17"/>
-          <w:szCs w:val="17"/>
-        </w:rPr>
-        <w:t xml:space="preserve">https://creativecommons.org/licenses/by/3.0/</w:t>
-      </w:r>
+          <w:sz w:val="18"/>
+          <w:szCs w:val="18"/>
+        </w:rPr>
+        <w:t xml:space="preserve">DELIVERY — Q0ywo — CC BY-SA 4.0</w:t>
+      </w:r>
+    </w:p>
+    <w:p>
+      <w:pPr>
+        <w:spacing w:after="95"/>
+      </w:pPr>
+      <w:hyperlink w:history="1" r:id="rIdgfytezukmadtj-8dzidik">
+        <w:r>
+          <w:rPr>
+            <w:rStyle w:val="Hyperlink"/>
+            <w:sz w:val="16"/>
+            <w:szCs w:val="16"/>
+          </w:rPr>
+          <w:t xml:space="preserve">Photograph source</w:t>
+        </w:r>
+      </w:hyperlink>
+      <w:r>
+        <w:rPr>
+          <w:sz w:val="16"/>
+          <w:szCs w:val="16"/>
+        </w:rPr>
+        <w:t xml:space="preserve">  ·  </w:t>
+      </w:r>
+      <w:hyperlink w:history="1" r:id="rId6lq3qcnymzxyvt3tpcyba">
+        <w:r>
+          <w:rPr>
+            <w:rStyle w:val="Hyperlink"/>
+            <w:sz w:val="16"/>
+            <w:szCs w:val="16"/>
+          </w:rPr>
+          <w:t xml:space="preserve">Licence terms</w:t>
+        </w:r>
+      </w:hyperlink>
+    </w:p>
+    <w:p>
+      <w:pPr>
+        <w:keepNext/>
+        <w:spacing w:after="20" w:before="0"/>
+      </w:pPr>
+      <w:r>
+        <w:rPr>
+          <w:b/>
+          <w:bCs/>
+          <w:color w:val="202124"/>
+          <w:sz w:val="18"/>
+          <w:szCs w:val="18"/>
+        </w:rPr>
+        <w:t xml:space="preserve">CAR — Grendelkhan — CC BY-SA 4.0</w:t>
+      </w:r>
+    </w:p>
+    <w:p>
+      <w:pPr>
+        <w:spacing w:after="95"/>
+      </w:pPr>
+      <w:hyperlink w:history="1" r:id="rIdfca097fcgbsoerxuxgrg-">
+        <w:r>
+          <w:rPr>
+            <w:rStyle w:val="Hyperlink"/>
+            <w:sz w:val="16"/>
+            <w:szCs w:val="16"/>
+          </w:rPr>
+          <w:t xml:space="preserve">Photograph source</w:t>
+        </w:r>
+      </w:hyperlink>
+      <w:r>
+        <w:rPr>
+          <w:sz w:val="16"/>
+          <w:szCs w:val="16"/>
+        </w:rPr>
+        <w:t xml:space="preserve">  ·  </w:t>
+      </w:r>
+      <w:hyperlink w:history="1" r:id="rIdkesim6xho2kap7zbmuhff">
+        <w:r>
+          <w:rPr>
+            <w:rStyle w:val="Hyperlink"/>
+            <w:sz w:val="16"/>
+            <w:szCs w:val="16"/>
+          </w:rPr>
+          <w:t xml:space="preserve">Licence terms</w:t>
+        </w:r>
+      </w:hyperlink>
+    </w:p>
+    <w:p>
+      <w:pPr>
+        <w:keepNext/>
+        <w:spacing w:after="20" w:before="0"/>
+      </w:pPr>
+      <w:r>
+        <w:rPr>
+          <w:b/>
+          <w:bCs/>
+          <w:color w:val="202124"/>
+          <w:sz w:val="18"/>
+          <w:szCs w:val="18"/>
+        </w:rPr>
+        <w:t xml:space="preserve">WASHING — zzpza — CC BY 2.0</w:t>
+      </w:r>
+    </w:p>
+    <w:p>
+      <w:pPr>
+        <w:spacing w:after="95"/>
+      </w:pPr>
+      <w:hyperlink w:history="1" r:id="rIdkzmauv8lznuy5wcee92ll">
+        <w:r>
+          <w:rPr>
+            <w:rStyle w:val="Hyperlink"/>
+            <w:sz w:val="16"/>
+            <w:szCs w:val="16"/>
+          </w:rPr>
+          <w:t xml:space="preserve">Photograph source</w:t>
+        </w:r>
+      </w:hyperlink>
+      <w:r>
+        <w:rPr>
+          <w:sz w:val="16"/>
+          <w:szCs w:val="16"/>
+        </w:rPr>
+        <w:t xml:space="preserve">  ·  </w:t>
+      </w:r>
+      <w:hyperlink w:history="1" r:id="rId9gczbyda6nmqtbkgpepvp">
+        <w:r>
+          <w:rPr>
+            <w:rStyle w:val="Hyperlink"/>
+            <w:sz w:val="16"/>
+            <w:szCs w:val="16"/>
+          </w:rPr>
+          <w:t xml:space="preserve">Licence terms</w:t>
+        </w:r>
+      </w:hyperlink>
+    </w:p>
+    <w:p>
+      <w:pPr>
+        <w:keepNext/>
+        <w:spacing w:after="20" w:before="0"/>
+      </w:pPr>
+      <w:r>
+        <w:rPr>
+          <w:b/>
+          <w:bCs/>
+          <w:color w:val="202124"/>
+          <w:sz w:val="18"/>
+          <w:szCs w:val="18"/>
+        </w:rPr>
+        <w:t xml:space="preserve">CHESS — Jorge Royan — CC BY-SA 3.0</w:t>
+      </w:r>
+    </w:p>
+    <w:p>
+      <w:pPr>
+        <w:spacing w:after="95"/>
+      </w:pPr>
+      <w:hyperlink w:history="1" r:id="rIdjrkiauqbpktnppc4eutra">
+        <w:r>
+          <w:rPr>
+            <w:rStyle w:val="Hyperlink"/>
+            <w:sz w:val="16"/>
+            <w:szCs w:val="16"/>
+          </w:rPr>
+          <w:t xml:space="preserve">Photograph source</w:t>
+        </w:r>
+      </w:hyperlink>
+      <w:r>
+        <w:rPr>
+          <w:sz w:val="16"/>
+          <w:szCs w:val="16"/>
+        </w:rPr>
+        <w:t xml:space="preserve">  ·  </w:t>
+      </w:r>
+      <w:hyperlink w:history="1" r:id="rIdbgvpqqpflh9halfn_nuxc">
+        <w:r>
+          <w:rPr>
+            <w:rStyle w:val="Hyperlink"/>
+            <w:sz w:val="16"/>
+            <w:szCs w:val="16"/>
+          </w:rPr>
+          <w:t xml:space="preserve">Licence terms</w:t>
+        </w:r>
+      </w:hyperlink>
+    </w:p>
+    <w:p>
+      <w:pPr>
+        <w:keepNext/>
+        <w:spacing w:after="20" w:before="0"/>
+      </w:pPr>
+      <w:r>
+        <w:rPr>
+          <w:b/>
+          <w:bCs/>
+          <w:color w:val="202124"/>
+          <w:sz w:val="18"/>
+          <w:szCs w:val="18"/>
+        </w:rPr>
+        <w:t xml:space="preserve">PRINTER — Kskhh — CC BY-SA 4.0</w:t>
+      </w:r>
+    </w:p>
+    <w:p>
+      <w:pPr>
+        <w:spacing w:after="95"/>
+      </w:pPr>
+      <w:hyperlink w:history="1" r:id="rIddact7rg4-ms9jke_nsd0h">
+        <w:r>
+          <w:rPr>
+            <w:rStyle w:val="Hyperlink"/>
+            <w:sz w:val="16"/>
+            <w:szCs w:val="16"/>
+          </w:rPr>
+          <w:t xml:space="preserve">Photograph source</w:t>
+        </w:r>
+      </w:hyperlink>
+      <w:r>
+        <w:rPr>
+          <w:sz w:val="16"/>
+          <w:szCs w:val="16"/>
+        </w:rPr>
+        <w:t xml:space="preserve">  ·  </w:t>
+      </w:r>
+      <w:hyperlink w:history="1" r:id="rIdfwzbzbiup9syj4uexni9n">
+        <w:r>
+          <w:rPr>
+            <w:rStyle w:val="Hyperlink"/>
+            <w:sz w:val="16"/>
+            <w:szCs w:val="16"/>
+          </w:rPr>
+          <w:t xml:space="preserve">Licence terms</w:t>
+        </w:r>
+      </w:hyperlink>
+    </w:p>
+    <w:p>
+      <w:pPr>
+        <w:keepNext/>
+        <w:spacing w:after="20" w:before="0"/>
+      </w:pPr>
+      <w:r>
+        <w:rPr>
+          <w:b/>
+          <w:bCs/>
+          <w:color w:val="202124"/>
+          <w:sz w:val="18"/>
+          <w:szCs w:val="18"/>
+        </w:rPr>
+        <w:t xml:space="preserve">DOCTOR — University of Michigan Medical School Information Services — CC BY 2.0</w:t>
+      </w:r>
+    </w:p>
+    <w:p>
+      <w:pPr>
+        <w:spacing w:after="95"/>
+      </w:pPr>
+      <w:hyperlink w:history="1" r:id="rIdvkaxkozwy0ahjljqar_gz">
+        <w:r>
+          <w:rPr>
+            <w:rStyle w:val="Hyperlink"/>
+            <w:sz w:val="16"/>
+            <w:szCs w:val="16"/>
+          </w:rPr>
+          <w:t xml:space="preserve">Photograph source</w:t>
+        </w:r>
+      </w:hyperlink>
+      <w:r>
+        <w:rPr>
+          <w:sz w:val="16"/>
+          <w:szCs w:val="16"/>
+        </w:rPr>
+        <w:t xml:space="preserve">  ·  </w:t>
+      </w:r>
+      <w:hyperlink w:history="1" r:id="rIdpqtdccldppxmxdxfulxk8">
+        <w:r>
+          <w:rPr>
+            <w:rStyle w:val="Hyperlink"/>
+            <w:sz w:val="16"/>
+            <w:szCs w:val="16"/>
+          </w:rPr>
+          <w:t xml:space="preserve">Licence terms</w:t>
+        </w:r>
+      </w:hyperlink>
+    </w:p>
+    <w:p>
+      <w:pPr>
+        <w:keepNext/>
+        <w:spacing w:after="20" w:before="0"/>
+      </w:pPr>
+      <w:r>
+        <w:rPr>
+          <w:b/>
+          <w:bCs/>
+          <w:color w:val="202124"/>
+          <w:sz w:val="18"/>
+          <w:szCs w:val="18"/>
+        </w:rPr>
+        <w:t xml:space="preserve">CAT — Alvesgaspar — CC BY-SA 3.0</w:t>
+      </w:r>
+    </w:p>
+    <w:p>
+      <w:pPr>
+        <w:spacing w:after="95"/>
+      </w:pPr>
+      <w:hyperlink w:history="1" r:id="rIdjwvnarfb6ztwswwl7gpuh">
+        <w:r>
+          <w:rPr>
+            <w:rStyle w:val="Hyperlink"/>
+            <w:sz w:val="16"/>
+            <w:szCs w:val="16"/>
+          </w:rPr>
+          <w:t xml:space="preserve">Photograph source</w:t>
+        </w:r>
+      </w:hyperlink>
+      <w:r>
+        <w:rPr>
+          <w:sz w:val="16"/>
+          <w:szCs w:val="16"/>
+        </w:rPr>
+        <w:t xml:space="preserve">  ·  </w:t>
+      </w:r>
+      <w:hyperlink w:history="1" r:id="rIdvqc08u7ye0gymz0uce5kd">
+        <w:r>
+          <w:rPr>
+            <w:rStyle w:val="Hyperlink"/>
+            <w:sz w:val="16"/>
+            <w:szCs w:val="16"/>
+          </w:rPr>
+          <w:t xml:space="preserve">Licence terms</w:t>
+        </w:r>
+      </w:hyperlink>
+    </w:p>
+    <w:p>
+      <w:pPr>
+        <w:keepNext/>
+        <w:spacing w:after="20" w:before="0"/>
+      </w:pPr>
+      <w:r>
+        <w:rPr>
+          <w:b/>
+          <w:bCs/>
+          <w:color w:val="202124"/>
+          <w:sz w:val="18"/>
+          <w:szCs w:val="18"/>
+        </w:rPr>
+        <w:t xml:space="preserve">DOG — Losch — CC BY-SA 3.0</w:t>
+      </w:r>
+    </w:p>
+    <w:p>
+      <w:pPr>
+        <w:spacing w:after="95"/>
+      </w:pPr>
+      <w:hyperlink w:history="1" r:id="rIdwsyj4jg5sq-quc1cyztra">
+        <w:r>
+          <w:rPr>
+            <w:rStyle w:val="Hyperlink"/>
+            <w:sz w:val="16"/>
+            <w:szCs w:val="16"/>
+          </w:rPr>
+          <w:t xml:space="preserve">Photograph source</w:t>
+        </w:r>
+      </w:hyperlink>
+      <w:r>
+        <w:rPr>
+          <w:sz w:val="16"/>
+          <w:szCs w:val="16"/>
+        </w:rPr>
+        <w:t xml:space="preserve">  ·  </w:t>
+      </w:r>
+      <w:hyperlink w:history="1" r:id="rIdzqnapp5f47-tcmo1h54gl">
+        <w:r>
+          <w:rPr>
+            <w:rStyle w:val="Hyperlink"/>
+            <w:sz w:val="16"/>
+            <w:szCs w:val="16"/>
+          </w:rPr>
+          <w:t xml:space="preserve">Licence terms</w:t>
+        </w:r>
+      </w:hyperlink>
+    </w:p>
+    <w:p>
+      <w:pPr>
+        <w:keepNext/>
+        <w:spacing w:after="20" w:before="0"/>
+      </w:pPr>
+      <w:r>
+        <w:rPr>
+          <w:b/>
+          <w:bCs/>
+          <w:color w:val="202124"/>
+          <w:sz w:val="18"/>
+          <w:szCs w:val="18"/>
+        </w:rPr>
+        <w:t xml:space="preserve">ASSISTANT — Maurizio Pesce from Milan, Italia — CC BY-SA 4.0</w:t>
+      </w:r>
+    </w:p>
+    <w:p>
+      <w:pPr>
+        <w:spacing w:after="95"/>
+      </w:pPr>
+      <w:hyperlink w:history="1" r:id="rIduovycin31ryhrdjynro8x">
+        <w:r>
+          <w:rPr>
+            <w:rStyle w:val="Hyperlink"/>
+            <w:sz w:val="16"/>
+            <w:szCs w:val="16"/>
+          </w:rPr>
+          <w:t xml:space="preserve">Photograph source</w:t>
+        </w:r>
+      </w:hyperlink>
+      <w:r>
+        <w:rPr>
+          <w:sz w:val="16"/>
+          <w:szCs w:val="16"/>
+        </w:rPr>
+        <w:t xml:space="preserve">  ·  </w:t>
+      </w:r>
+      <w:hyperlink w:history="1" r:id="rIdreevfwqkvw3jfqvswaegt">
+        <w:r>
+          <w:rPr>
+            <w:rStyle w:val="Hyperlink"/>
+            <w:sz w:val="16"/>
+            <w:szCs w:val="16"/>
+          </w:rPr>
+          <w:t xml:space="preserve">Licence terms</w:t>
+        </w:r>
+      </w:hyperlink>
+    </w:p>
+    <w:p>
+      <w:pPr>
+        <w:keepNext/>
+        <w:spacing w:after="20" w:before="0"/>
+      </w:pPr>
+      <w:r>
+        <w:rPr>
+          <w:b/>
+          <w:bCs/>
+          <w:color w:val="202124"/>
+          <w:sz w:val="18"/>
+          <w:szCs w:val="18"/>
+        </w:rPr>
+        <w:t xml:space="preserve">CLOUDS — Michael Jastremski — CC BY-SA 2.0</w:t>
+      </w:r>
+    </w:p>
+    <w:p>
+      <w:pPr>
+        <w:spacing w:after="95"/>
+      </w:pPr>
+      <w:hyperlink w:history="1" r:id="rIdjsn2ujigc4tiar5tc6iip">
+        <w:r>
+          <w:rPr>
+            <w:rStyle w:val="Hyperlink"/>
+            <w:sz w:val="16"/>
+            <w:szCs w:val="16"/>
+          </w:rPr>
+          <w:t xml:space="preserve">Photograph source</w:t>
+        </w:r>
+      </w:hyperlink>
+      <w:r>
+        <w:rPr>
+          <w:sz w:val="16"/>
+          <w:szCs w:val="16"/>
+        </w:rPr>
+        <w:t xml:space="preserve">  ·  </w:t>
+      </w:r>
+      <w:hyperlink w:history="1" r:id="rIdtadzm87qcvimgfsvtczsc">
+        <w:r>
+          <w:rPr>
+            <w:rStyle w:val="Hyperlink"/>
+            <w:sz w:val="16"/>
+            <w:szCs w:val="16"/>
+          </w:rPr>
+          <w:t xml:space="preserve">Licence terms</w:t>
+        </w:r>
+      </w:hyperlink>
+    </w:p>
+    <w:p>
+      <w:pPr>
+        <w:keepNext/>
+        <w:spacing w:after="20" w:before="0"/>
+      </w:pPr>
+      <w:r>
+        <w:rPr>
+          <w:b/>
+          <w:bCs/>
+          <w:color w:val="202124"/>
+          <w:sz w:val="18"/>
+          <w:szCs w:val="18"/>
+        </w:rPr>
+        <w:t xml:space="preserve">GAMES — Soupmeister — CC BY-SA 2.0</w:t>
+      </w:r>
+    </w:p>
+    <w:p>
+      <w:pPr>
+        <w:spacing w:after="95"/>
+      </w:pPr>
+      <w:hyperlink w:history="1" r:id="rIdnr8-0zlpvixvqe4ecthmk">
+        <w:r>
+          <w:rPr>
+            <w:rStyle w:val="Hyperlink"/>
+            <w:sz w:val="16"/>
+            <w:szCs w:val="16"/>
+          </w:rPr>
+          <w:t xml:space="preserve">Photograph source</w:t>
+        </w:r>
+      </w:hyperlink>
+      <w:r>
+        <w:rPr>
+          <w:sz w:val="16"/>
+          <w:szCs w:val="16"/>
+        </w:rPr>
+        <w:t xml:space="preserve">  ·  </w:t>
+      </w:r>
+      <w:hyperlink w:history="1" r:id="rIduqfrsatb9moxwbyokcuia">
+        <w:r>
+          <w:rPr>
+            <w:rStyle w:val="Hyperlink"/>
+            <w:sz w:val="16"/>
+            <w:szCs w:val="16"/>
+          </w:rPr>
+          <w:t xml:space="preserve">Licence terms</w:t>
+        </w:r>
+      </w:hyperlink>
+    </w:p>
+    <w:p>
+      <w:pPr>
+        <w:keepNext/>
+        <w:spacing w:after="20" w:before="0"/>
+      </w:pPr>
+      <w:r>
+        <w:rPr>
+          <w:b/>
+          <w:bCs/>
+          <w:color w:val="202124"/>
+          <w:sz w:val="18"/>
+          <w:szCs w:val="18"/>
+        </w:rPr>
+        <w:t xml:space="preserve">TRAFFIC — Unisouth — CC BY 3.0</w:t>
+      </w:r>
+    </w:p>
+    <w:p>
+      <w:pPr>
+        <w:spacing w:after="95"/>
+      </w:pPr>
+      <w:hyperlink w:history="1" r:id="rId8epyaj2fcdzhwxaoz8qhq">
+        <w:r>
+          <w:rPr>
+            <w:rStyle w:val="Hyperlink"/>
+            <w:sz w:val="16"/>
+            <w:szCs w:val="16"/>
+          </w:rPr>
+          <w:t xml:space="preserve">Photograph source</w:t>
+        </w:r>
+      </w:hyperlink>
+      <w:r>
+        <w:rPr>
+          <w:sz w:val="16"/>
+          <w:szCs w:val="16"/>
+        </w:rPr>
+        <w:t xml:space="preserve">  ·  </w:t>
+      </w:r>
+      <w:hyperlink w:history="1" r:id="rIdwapsouixm6nvtgfbghfez">
+        <w:r>
+          <w:rPr>
+            <w:rStyle w:val="Hyperlink"/>
+            <w:sz w:val="16"/>
+            <w:szCs w:val="16"/>
+          </w:rPr>
+          <w:t xml:space="preserve">Licence terms</w:t>
+        </w:r>
+      </w:hyperlink>
     </w:p>
     <w:p>
       <w:pPr>
@@ -11194,7 +11855,7 @@
           <w:sz w:val="21"/>
           <w:szCs w:val="21"/>
         </w:rPr>
-        <w:t xml:space="preserve">Complete audit: 0478 P1/Artificial Intelligence/AI_Exam_Coverage.md in the source repository.</w:t>
+        <w:t xml:space="preserve">Complete exam audit: 0478 P1/Artificial Intelligence/AI_Exam_Coverage.md in the source repository.</w:t>
       </w:r>
     </w:p>
     <w:sectPr>

</xml_diff>